<commit_message>
many labs for every subject, everything works afais
</commit_message>
<xml_diff>
--- a/ос/лабы/3/лаб03.docx
+++ b/ос/лабы/3/лаб03.docx
@@ -758,377 +758,69 @@
     <w:p>
       <w:pPr>
         <w:pStyle w:val="a7"/>
-        <w:numPr>
-          <w:ilvl w:val="0"/>
-          <w:numId w:val="23"/>
-        </w:numPr>
         <w:spacing w:after="0" w:line="240" w:lineRule="auto"/>
-        <w:jc w:val="left"/>
-        <w:rPr>
-          <w:lang w:val="ru-RU"/>
-        </w:rPr>
-      </w:pPr>
-      <w:r>
-        <w:rPr>
-          <w:lang w:val="ru-RU"/>
-        </w:rPr>
-        <w:t>интернет</w:t>
-      </w:r>
-      <w:r>
-        <w:rPr>
-          <w:lang w:val="ru-RU"/>
-        </w:rPr>
-        <w:t>-</w:t>
-      </w:r>
-      <w:r>
-        <w:rPr>
-          <w:lang w:val="ru-RU"/>
-        </w:rPr>
-        <w:t>ресурс</w:t>
-      </w:r>
-      <w:r>
-        <w:rPr>
-          <w:lang w:val="ru-RU"/>
-        </w:rPr>
-        <w:t xml:space="preserve"> </w:t>
-      </w:r>
-      <w:r>
-        <w:t>https</w:t>
-      </w:r>
-      <w:r>
-        <w:rPr>
-          <w:lang w:val="ru-RU"/>
-        </w:rPr>
-        <w:t>://</w:t>
-      </w:r>
-      <w:r>
-        <w:t>learn</w:t>
-      </w:r>
-      <w:r>
-        <w:rPr>
-          <w:lang w:val="ru-RU"/>
-        </w:rPr>
-        <w:t>.</w:t>
-      </w:r>
-      <w:proofErr w:type="spellStart"/>
-      <w:r>
-        <w:t>microsoft</w:t>
-      </w:r>
-      <w:proofErr w:type="spellEnd"/>
-      <w:r>
-        <w:rPr>
-          <w:lang w:val="ru-RU"/>
-        </w:rPr>
-        <w:t>.</w:t>
-      </w:r>
-      <w:r>
-        <w:t>com</w:t>
-      </w:r>
-      <w:r>
-        <w:rPr>
-          <w:lang w:val="ru-RU"/>
-        </w:rPr>
-        <w:t>/</w:t>
-      </w:r>
-      <w:proofErr w:type="spellStart"/>
-      <w:r>
-        <w:t>en</w:t>
-      </w:r>
-      <w:proofErr w:type="spellEnd"/>
-      <w:r>
-        <w:rPr>
-          <w:lang w:val="ru-RU"/>
-        </w:rPr>
-        <w:t>/</w:t>
-      </w:r>
-      <w:r>
-        <w:t>us</w:t>
-      </w:r>
-      <w:r>
-        <w:rPr>
-          <w:lang w:val="ru-RU"/>
-        </w:rPr>
-        <w:t>/</w:t>
-      </w:r>
-      <w:r>
-        <w:t>windows</w:t>
-      </w:r>
-      <w:r>
-        <w:rPr>
-          <w:lang w:val="ru-RU"/>
-        </w:rPr>
-        <w:t>/</w:t>
-      </w:r>
-      <w:r>
-        <w:t>win</w:t>
-      </w:r>
-      <w:r>
-        <w:rPr>
-          <w:lang w:val="ru-RU"/>
-        </w:rPr>
-        <w:t>32/</w:t>
-      </w:r>
-      <w:proofErr w:type="spellStart"/>
-      <w:r>
-        <w:t>procthread</w:t>
-      </w:r>
-      <w:proofErr w:type="spellEnd"/>
-      <w:r>
-        <w:rPr>
-          <w:lang w:val="ru-RU"/>
-        </w:rPr>
-        <w:t>/</w:t>
-      </w:r>
-      <w:r>
-        <w:t>processes</w:t>
-      </w:r>
-      <w:r>
-        <w:rPr>
-          <w:lang w:val="ru-RU"/>
-        </w:rPr>
-        <w:t>-</w:t>
-      </w:r>
-      <w:r>
-        <w:t>and</w:t>
-      </w:r>
-      <w:r>
-        <w:rPr>
-          <w:lang w:val="ru-RU"/>
-        </w:rPr>
-        <w:t>-</w:t>
-      </w:r>
-      <w:r>
-        <w:t>threads</w:t>
-      </w:r>
-      <w:r>
-        <w:rPr>
-          <w:lang w:val="ru-RU"/>
-        </w:rPr>
-        <w:t>;</w:t>
+        <w:ind w:left="360"/>
+      </w:pPr>
+      <w:r>
+        <w:rPr>
+          <w:lang w:val="ru-RU"/>
+        </w:rPr>
+        <w:br w:type="page"/>
       </w:r>
     </w:p>
     <w:p>
       <w:pPr>
-        <w:pStyle w:val="a7"/>
-        <w:numPr>
-          <w:ilvl w:val="0"/>
-          <w:numId w:val="23"/>
-        </w:numPr>
-        <w:spacing w:after="0" w:line="240" w:lineRule="auto"/>
-        <w:rPr>
-          <w:lang w:val="ru-RU"/>
-        </w:rPr>
-      </w:pPr>
-      <w:r>
-        <w:rPr>
-          <w:lang w:val="ru-RU"/>
-        </w:rPr>
-        <w:t>интернет-ресурс</w:t>
-      </w:r>
-      <w:r>
-        <w:rPr>
-          <w:lang w:val="ru-RU"/>
-        </w:rPr>
+        <w:pStyle w:val="af0"/>
+        <w:rPr>
+          <w:lang w:val="en-US"/>
+        </w:rPr>
+      </w:pPr>
+      <w:r>
+        <w:lastRenderedPageBreak/>
+        <w:tab/>
+      </w:r>
+      <w:r>
+        <w:t>1</w:t>
+      </w:r>
+      <w:r>
         <w:t xml:space="preserve"> </w:t>
       </w:r>
       <w:r>
-        <w:t>https</w:t>
-      </w:r>
-      <w:r>
-        <w:rPr>
-          <w:lang w:val="ru-RU"/>
-        </w:rPr>
-        <w:t>://</w:t>
-      </w:r>
-      <w:r>
-        <w:t>learn</w:t>
-      </w:r>
-      <w:r>
-        <w:rPr>
-          <w:lang w:val="ru-RU"/>
-        </w:rPr>
-        <w:t>.</w:t>
-      </w:r>
-      <w:proofErr w:type="spellStart"/>
-      <w:r>
-        <w:t>microsoft</w:t>
-      </w:r>
-      <w:proofErr w:type="spellEnd"/>
-      <w:r>
-        <w:rPr>
-          <w:lang w:val="ru-RU"/>
-        </w:rPr>
-        <w:t>.</w:t>
-      </w:r>
-      <w:r>
-        <w:t>com</w:t>
-      </w:r>
-      <w:r>
-        <w:rPr>
-          <w:lang w:val="ru-RU"/>
-        </w:rPr>
-        <w:t>/</w:t>
-      </w:r>
-      <w:proofErr w:type="spellStart"/>
-      <w:r>
-        <w:t>en</w:t>
-      </w:r>
-      <w:proofErr w:type="spellEnd"/>
-      <w:r>
-        <w:rPr>
-          <w:lang w:val="ru-RU"/>
-        </w:rPr>
-        <w:t>-</w:t>
-      </w:r>
-      <w:r>
-        <w:t>us</w:t>
-      </w:r>
-      <w:r>
-        <w:rPr>
-          <w:lang w:val="ru-RU"/>
-        </w:rPr>
-        <w:t>/</w:t>
-      </w:r>
-      <w:r>
-        <w:t>windows</w:t>
-      </w:r>
-      <w:r>
-        <w:rPr>
-          <w:lang w:val="ru-RU"/>
-        </w:rPr>
-        <w:t>/</w:t>
-      </w:r>
-      <w:r>
-        <w:t>win</w:t>
-      </w:r>
-      <w:r>
-        <w:rPr>
-          <w:lang w:val="ru-RU"/>
-        </w:rPr>
-        <w:t>32/</w:t>
-      </w:r>
-      <w:proofErr w:type="spellStart"/>
-      <w:r>
-        <w:t>ipc</w:t>
-      </w:r>
-      <w:proofErr w:type="spellEnd"/>
-      <w:r>
-        <w:rPr>
-          <w:lang w:val="ru-RU"/>
-        </w:rPr>
-        <w:t>/</w:t>
-      </w:r>
-      <w:r>
-        <w:t>pipes</w:t>
-      </w:r>
-      <w:r>
-        <w:rPr>
-          <w:lang w:val="ru-RU"/>
-        </w:rPr>
-        <w:t>/</w:t>
-      </w:r>
-      <w:r>
-        <w:rPr>
-          <w:lang w:val="ru-RU"/>
-        </w:rPr>
-        <w:t>.</w:t>
+        <w:rPr>
+          <w:lang w:val="en-US"/>
+        </w:rPr>
+        <w:t>Linux</w:t>
       </w:r>
     </w:p>
     <w:p>
       <w:pPr>
-        <w:pStyle w:val="a7"/>
-        <w:spacing w:after="0" w:line="240" w:lineRule="auto"/>
-        <w:ind w:left="360"/>
-        <w:rPr>
-          <w:lang w:val="ru-RU"/>
-        </w:rPr>
-      </w:pPr>
-      <w:r>
-        <w:rPr>
-          <w:lang w:val="ru-RU"/>
-        </w:rPr>
-        <w:br w:type="page"/>
+        <w:pStyle w:val="af4"/>
+        <w:rPr>
+          <w:lang w:val="ru-RU"/>
+        </w:rPr>
+      </w:pPr>
+      <w:r>
+        <w:rPr>
+          <w:lang w:val="ru-RU"/>
+        </w:rPr>
+        <w:t>1</w:t>
+      </w:r>
+      <w:r>
+        <w:rPr>
+          <w:lang w:val="ru-RU"/>
+        </w:rPr>
+        <w:t xml:space="preserve">.1 </w:t>
+      </w:r>
+      <w:r>
+        <w:rPr>
+          <w:lang w:val="ru-RU"/>
+        </w:rPr>
+        <w:t>Уровень 4-5</w:t>
       </w:r>
     </w:p>
     <w:p>
       <w:pPr>
-        <w:pStyle w:val="ac"/>
-      </w:pPr>
-      <w:r>
-        <w:lastRenderedPageBreak/>
-        <w:tab/>
-      </w:r>
-      <w:r>
-        <w:t>1</w:t>
-      </w:r>
-      <w:r>
-        <w:t xml:space="preserve"> </w:t>
-      </w:r>
-      <w:r>
-        <w:t>Основная часть</w:t>
-      </w:r>
-    </w:p>
-    <w:p>
-      <w:pPr>
-        <w:pStyle w:val="af0"/>
-      </w:pPr>
-      <w:r>
-        <w:tab/>
-      </w:r>
-      <w:r>
-        <w:t>1</w:t>
-      </w:r>
-      <w:r>
-        <w:t xml:space="preserve">.1 </w:t>
-      </w:r>
-      <w:r>
-        <w:t xml:space="preserve">Решение на системе </w:t>
-      </w:r>
-      <w:r>
-        <w:rPr>
-          <w:lang w:val="en-US"/>
-        </w:rPr>
-        <w:t>Linux</w:t>
-      </w:r>
-      <w:r>
-        <w:t xml:space="preserve">. </w:t>
-      </w:r>
-      <w:r>
-        <w:t>Уровень 4-5</w:t>
-      </w:r>
-    </w:p>
-    <w:p>
-      <w:pPr>
-        <w:pStyle w:val="af4"/>
-        <w:rPr>
-          <w:lang w:val="ru-RU"/>
-        </w:rPr>
-      </w:pPr>
-      <w:r>
-        <w:rPr>
-          <w:lang w:val="ru-RU"/>
-        </w:rPr>
-        <w:t>1</w:t>
-      </w:r>
-      <w:r>
-        <w:rPr>
-          <w:lang w:val="ru-RU"/>
-        </w:rPr>
-        <w:t xml:space="preserve">.1.1 </w:t>
-      </w:r>
-      <w:r>
-        <w:rPr>
-          <w:lang w:val="ru-RU"/>
-        </w:rPr>
-        <w:t>Задание 1</w:t>
-      </w:r>
-    </w:p>
-    <w:p>
-      <w:pPr>
         <w:spacing w:after="240"/>
-        <w:rPr>
-          <w:lang w:val="ru-RU"/>
-        </w:rPr>
       </w:pPr>
       <w:r>
         <w:rPr>
@@ -2520,7 +2212,6 @@
                 <w:rFonts w:ascii="Courier New" w:hAnsi="Courier New" w:cs="Courier New"/>
                 <w:sz w:val="24"/>
               </w:rPr>
-              <w:lastRenderedPageBreak/>
               <w:t xml:space="preserve">  }</w:t>
             </w:r>
           </w:p>
@@ -2702,7 +2393,6 @@
               <w:rPr>
                 <w:rFonts w:ascii="Courier New" w:hAnsi="Courier New" w:cs="Courier New"/>
                 <w:sz w:val="24"/>
-                <w:lang w:val="ru-RU"/>
               </w:rPr>
             </w:pPr>
             <w:r>
@@ -2862,26 +2552,6 @@
     </w:p>
     <w:p>
       <w:pPr>
-        <w:pStyle w:val="af2"/>
-        <w:rPr>
-          <w:lang w:val="ru-RU"/>
-        </w:rPr>
-      </w:pPr>
-      <w:r>
-        <w:rPr>
-          <w:lang w:val="ru-RU"/>
-        </w:rPr>
-        <w:t>1</w:t>
-      </w:r>
-      <w:r>
-        <w:rPr>
-          <w:lang w:val="ru-RU"/>
-        </w:rPr>
-        <w:t>.1.2 Задание 2</w:t>
-      </w:r>
-    </w:p>
-    <w:p>
-      <w:pPr>
         <w:rPr>
           <w:lang w:val="ru-RU"/>
         </w:rPr>
@@ -3058,7 +2728,6 @@
         <w:jc w:val="both"/>
       </w:pPr>
       <w:r>
-        <w:lastRenderedPageBreak/>
         <w:tab/>
       </w:r>
       <w:r>
@@ -3079,6 +2748,7 @@
         <w:rPr>
           <w:lang w:val="ru-RU"/>
         </w:rPr>
+        <w:lastRenderedPageBreak/>
         <w:drawing>
           <wp:inline distT="0" distB="0" distL="0" distR="0" wp14:anchorId="1A8EFCB7" wp14:editId="5D1A546D">
             <wp:extent cx="2628900" cy="3432354"/>
@@ -3156,48 +2826,104 @@
     </w:p>
     <w:p>
       <w:pPr>
-        <w:pStyle w:val="afa"/>
-      </w:pPr>
-      <w:r>
+        <w:pStyle w:val="af4"/>
+        <w:rPr>
+          <w:lang w:val="ru-RU"/>
+        </w:rPr>
+      </w:pPr>
+      <w:r>
+        <w:rPr>
+          <w:lang w:val="ru-RU"/>
+        </w:rPr>
         <w:t>1</w:t>
       </w:r>
       <w:r>
-        <w:t xml:space="preserve">.2 </w:t>
-      </w:r>
-      <w:r>
-        <w:t xml:space="preserve">Решение на системе </w:t>
-      </w:r>
-      <w:r>
-        <w:rPr>
-          <w:lang w:val="en-US"/>
-        </w:rPr>
-        <w:t>Linux</w:t>
-      </w:r>
-      <w:r>
-        <w:t xml:space="preserve">. </w:t>
-      </w:r>
-      <w:r>
+        <w:rPr>
+          <w:lang w:val="ru-RU"/>
+        </w:rPr>
+        <w:t>.</w:t>
+      </w:r>
+      <w:r>
+        <w:t>2</w:t>
+      </w:r>
+      <w:r>
+        <w:rPr>
+          <w:lang w:val="ru-RU"/>
+        </w:rPr>
+        <w:t xml:space="preserve"> </w:t>
+      </w:r>
+      <w:r>
+        <w:rPr>
+          <w:lang w:val="ru-RU"/>
+        </w:rPr>
         <w:t>Уровень 7-8</w:t>
       </w:r>
     </w:p>
     <w:p>
       <w:pPr>
-        <w:pStyle w:val="af4"/>
-        <w:rPr>
-          <w:lang w:val="ru-RU"/>
-        </w:rPr>
-      </w:pPr>
-      <w:r>
-        <w:rPr>
-          <w:lang w:val="ru-RU"/>
-        </w:rPr>
-        <w:t>1</w:t>
-      </w:r>
-      <w:r>
-        <w:rPr>
-          <w:lang w:val="ru-RU"/>
-        </w:rPr>
-        <w:t>.2.1 Задание 1</w:t>
+        <w:rPr>
+          <w:lang w:val="ru-RU"/>
+        </w:rPr>
+      </w:pPr>
+      <w:r>
+        <w:rPr>
+          <w:lang w:val="ru-RU"/>
+        </w:rPr>
+        <w:tab/>
+      </w:r>
+      <w:r>
+        <w:rPr>
+          <w:lang w:val="ru-RU"/>
+        </w:rPr>
+        <w:t xml:space="preserve">Исходный код для приложения </w:t>
+      </w:r>
+      <w:r>
+        <w:t>lab</w:t>
+      </w:r>
+      <w:r>
+        <w:rPr>
+          <w:lang w:val="ru-RU"/>
+        </w:rPr>
+        <w:t>03</w:t>
+      </w:r>
+      <w:r>
+        <w:t>client</w:t>
+      </w:r>
+      <w:r>
+        <w:rPr>
+          <w:lang w:val="ru-RU"/>
+        </w:rPr>
+        <w:t>, которое принимает два параметра</w:t>
+      </w:r>
+      <w:r>
+        <w:rPr>
+          <w:lang w:val="ru-RU"/>
+        </w:rPr>
+        <w:t xml:space="preserve">: </w:t>
+      </w:r>
+      <w:r>
+        <w:rPr>
+          <w:lang w:val="ru-RU"/>
+        </w:rPr>
+        <w:t>верхний и нижний порог диапазона чисел, в котором будет производить</w:t>
+      </w:r>
+      <w:r>
+        <w:rPr>
+          <w:lang w:val="ru-RU"/>
+        </w:rPr>
+        <w:t xml:space="preserve"> поиск простых чисел и отправлять данные родительскому процессу, представлен </w:t>
+      </w:r>
+      <w:r>
+        <w:rPr>
+          <w:lang w:val="ru-RU"/>
+        </w:rPr>
+        <w:t>в приложении А листинг А.2</w:t>
+      </w:r>
+      <w:r>
+        <w:rPr>
+          <w:lang w:val="ru-RU"/>
+        </w:rPr>
+        <w:t>.</w:t>
       </w:r>
     </w:p>
     <w:p>
@@ -3211,12 +2937,7 @@
           <w:lang w:val="ru-RU"/>
         </w:rPr>
         <w:tab/>
-      </w:r>
-      <w:r>
-        <w:rPr>
-          <w:lang w:val="ru-RU"/>
-        </w:rPr>
-        <w:t xml:space="preserve">Исходный код для приложения </w:t>
+        <w:t xml:space="preserve">Пример успешного выполнения приложения </w:t>
       </w:r>
       <w:r>
         <w:t>lab</w:t>
@@ -3234,85 +2955,23 @@
         <w:rPr>
           <w:lang w:val="ru-RU"/>
         </w:rPr>
-        <w:t>, которое принимает два параметра</w:t>
-      </w:r>
-      <w:r>
-        <w:rPr>
-          <w:lang w:val="ru-RU"/>
-        </w:rPr>
-        <w:t xml:space="preserve">: </w:t>
-      </w:r>
-      <w:r>
-        <w:rPr>
-          <w:lang w:val="ru-RU"/>
-        </w:rPr>
-        <w:t>верхний и нижний порог диапазона чисел, в котором будет производить</w:t>
-      </w:r>
-      <w:r>
-        <w:rPr>
-          <w:lang w:val="ru-RU"/>
-        </w:rPr>
-        <w:t xml:space="preserve"> поиск простых чисел и отправлять данные родительскому процессу, представлен </w:t>
-      </w:r>
-      <w:r>
-        <w:rPr>
-          <w:lang w:val="ru-RU"/>
-        </w:rPr>
-        <w:t>в приложении А листинг А.2</w:t>
-      </w:r>
-      <w:r>
-        <w:rPr>
-          <w:lang w:val="ru-RU"/>
-        </w:rPr>
-        <w:t>.</w:t>
+        <w:t xml:space="preserve"> </w:t>
+      </w:r>
+      <w:r>
+        <w:rPr>
+          <w:lang w:val="ru-RU"/>
+        </w:rPr>
+        <w:t xml:space="preserve">представлен на рисунке </w:t>
+      </w:r>
+      <w:r>
+        <w:rPr>
+          <w:lang w:val="ru-RU"/>
+        </w:rPr>
+        <w:t>1.4</w:t>
       </w:r>
     </w:p>
     <w:p>
       <w:pPr>
-        <w:rPr>
-          <w:lang w:val="ru-RU"/>
-        </w:rPr>
-      </w:pPr>
-      <w:r>
-        <w:rPr>
-          <w:lang w:val="ru-RU"/>
-        </w:rPr>
-        <w:tab/>
-        <w:t xml:space="preserve">Пример успешного выполнения приложения </w:t>
-      </w:r>
-      <w:r>
-        <w:t>lab</w:t>
-      </w:r>
-      <w:r>
-        <w:rPr>
-          <w:lang w:val="ru-RU"/>
-        </w:rPr>
-        <w:t>03</w:t>
-      </w:r>
-      <w:r>
-        <w:t>client</w:t>
-      </w:r>
-      <w:r>
-        <w:rPr>
-          <w:lang w:val="ru-RU"/>
-        </w:rPr>
-        <w:t xml:space="preserve"> </w:t>
-      </w:r>
-      <w:r>
-        <w:rPr>
-          <w:lang w:val="ru-RU"/>
-        </w:rPr>
-        <w:t xml:space="preserve">представлен на рисунке </w:t>
-      </w:r>
-      <w:r>
-        <w:rPr>
-          <w:lang w:val="ru-RU"/>
-        </w:rPr>
-        <w:t>1.4</w:t>
-      </w:r>
-    </w:p>
-    <w:p>
-      <w:pPr>
         <w:pStyle w:val="af6"/>
         <w:rPr>
           <w:lang w:val="ru-RU"/>
@@ -3323,9 +2982,9 @@
           <w:lang w:val="ru-RU"/>
         </w:rPr>
         <w:drawing>
-          <wp:inline distT="0" distB="0" distL="0" distR="0" wp14:anchorId="34B31CC6" wp14:editId="02FAEF2E">
-            <wp:extent cx="5257800" cy="882100"/>
-            <wp:effectExtent l="0" t="0" r="0" b="0"/>
+          <wp:inline distT="0" distB="0" distL="0" distR="0" wp14:anchorId="34B31CC6" wp14:editId="754C6ACE">
+            <wp:extent cx="6414770" cy="1076204"/>
+            <wp:effectExtent l="0" t="0" r="5080" b="0"/>
             <wp:docPr id="400529947" name="Рисунок 1"/>
             <wp:cNvGraphicFramePr>
               <a:graphicFrameLocks xmlns:a="http://schemas.openxmlformats.org/drawingml/2006/main" noChangeAspect="1"/>
@@ -3346,7 +3005,7 @@
                   <pic:spPr>
                     <a:xfrm>
                       <a:off x="0" y="0"/>
-                      <a:ext cx="5267982" cy="883808"/>
+                      <a:ext cx="6463032" cy="1084301"/>
                     </a:xfrm>
                     <a:prstGeom prst="rect">
                       <a:avLst/>
@@ -3432,7 +3091,6 @@
         <w:jc w:val="both"/>
       </w:pPr>
       <w:r>
-        <w:lastRenderedPageBreak/>
         <w:tab/>
         <w:t xml:space="preserve">Пример успешной работы программы </w:t>
       </w:r>
@@ -3466,6 +3124,7 @@
         <w:pStyle w:val="af6"/>
       </w:pPr>
       <w:r>
+        <w:lastRenderedPageBreak/>
         <w:drawing>
           <wp:inline distT="0" distB="0" distL="0" distR="0" wp14:anchorId="5AF4FCD5" wp14:editId="0CF5E346">
             <wp:extent cx="3967744" cy="3214255"/>
@@ -3546,19 +3205,10 @@
         <w:t>.3</w:t>
       </w:r>
       <w:r>
-        <w:t xml:space="preserve"> Решение на системе </w:t>
-      </w:r>
-      <w:r>
-        <w:rPr>
-          <w:lang w:val="en-US"/>
-        </w:rPr>
-        <w:t>Linux</w:t>
-      </w:r>
-      <w:r>
-        <w:t>.</w:t>
-      </w:r>
-      <w:r>
-        <w:t xml:space="preserve"> Уровень 9-10</w:t>
+        <w:t xml:space="preserve"> </w:t>
+      </w:r>
+      <w:r>
+        <w:t>Уровень 9-10</w:t>
       </w:r>
     </w:p>
     <w:p>
@@ -4025,7 +3675,6 @@
                 <w:rFonts w:ascii="Courier New" w:hAnsi="Courier New" w:cs="Courier New"/>
                 <w:sz w:val="24"/>
               </w:rPr>
-              <w:lastRenderedPageBreak/>
               <w:t xml:space="preserve">    </w:t>
             </w:r>
             <w:proofErr w:type="spellStart"/>
@@ -4717,6 +4366,9 @@
     <w:p>
       <w:pPr>
         <w:pStyle w:val="af8"/>
+        <w:rPr>
+          <w:lang w:val="en-US"/>
+        </w:rPr>
       </w:pPr>
       <w:r>
         <w:t xml:space="preserve">Рисунок </w:t>
@@ -4736,68 +4388,74 @@
     </w:p>
     <w:p>
       <w:pPr>
-        <w:pStyle w:val="afa"/>
-        <w:jc w:val="both"/>
-      </w:pPr>
-      <w:r>
-        <w:t>1</w:t>
-      </w:r>
-      <w:r>
-        <w:t xml:space="preserve">.4 </w:t>
-      </w:r>
-      <w:r>
-        <w:t xml:space="preserve">Решение на системе </w:t>
-      </w:r>
-      <w:r>
-        <w:rPr>
-          <w:lang w:val="en-US"/>
-        </w:rPr>
-        <w:t>Windows</w:t>
-      </w:r>
-      <w:r>
-        <w:t xml:space="preserve">. </w:t>
-      </w:r>
-      <w:r>
-        <w:t>Уровень 4-5</w:t>
+        <w:jc w:val="left"/>
+        <w:rPr>
+          <w:noProof/>
+        </w:rPr>
+      </w:pPr>
+      <w:r>
+        <w:br w:type="page"/>
       </w:r>
     </w:p>
     <w:p>
       <w:pPr>
-        <w:pStyle w:val="af4"/>
-        <w:rPr>
-          <w:lang w:val="ru-RU"/>
-        </w:rPr>
-      </w:pPr>
-      <w:r>
-        <w:rPr>
-          <w:lang w:val="ru-RU"/>
-        </w:rPr>
-        <w:t>1</w:t>
-      </w:r>
-      <w:r>
-        <w:rPr>
-          <w:lang w:val="ru-RU"/>
-        </w:rPr>
-        <w:t xml:space="preserve">.4.1 </w:t>
-      </w:r>
-      <w:r>
-        <w:rPr>
-          <w:lang w:val="ru-RU"/>
-        </w:rPr>
-        <w:t>Задание 1</w:t>
+        <w:pStyle w:val="afa"/>
+        <w:ind w:left="0" w:firstLine="709"/>
+        <w:jc w:val="both"/>
+        <w:rPr>
+          <w:lang w:val="en-US"/>
+        </w:rPr>
+      </w:pPr>
+      <w:r>
+        <w:rPr>
+          <w:lang w:val="en-US"/>
+        </w:rPr>
+        <w:lastRenderedPageBreak/>
+        <w:t>2</w:t>
+      </w:r>
+      <w:r>
+        <w:t xml:space="preserve"> </w:t>
+      </w:r>
+      <w:r>
+        <w:rPr>
+          <w:lang w:val="en-US"/>
+        </w:rPr>
+        <w:t>Windows</w:t>
       </w:r>
     </w:p>
     <w:p>
       <w:pPr>
-        <w:rPr>
-          <w:lang w:val="ru-RU"/>
-        </w:rPr>
-      </w:pPr>
-      <w:r>
-        <w:rPr>
-          <w:lang w:val="ru-RU"/>
-        </w:rPr>
-        <w:lastRenderedPageBreak/>
+        <w:pStyle w:val="af4"/>
+        <w:rPr>
+          <w:lang w:val="ru-RU"/>
+        </w:rPr>
+      </w:pPr>
+      <w:r>
+        <w:t>2.</w:t>
+      </w:r>
+      <w:r>
+        <w:rPr>
+          <w:lang w:val="ru-RU"/>
+        </w:rPr>
+        <w:t xml:space="preserve">1 </w:t>
+      </w:r>
+      <w:r>
+        <w:rPr>
+          <w:lang w:val="ru-RU"/>
+        </w:rPr>
+        <w:t>Уровень 4-5</w:t>
+      </w:r>
+    </w:p>
+    <w:p>
+      <w:pPr>
+        <w:rPr>
+          <w:lang w:val="ru-RU"/>
+        </w:rPr>
+      </w:pPr>
+      <w:r>
+        <w:rPr>
+          <w:lang w:val="ru-RU"/>
+        </w:rPr>
         <w:tab/>
       </w:r>
       <w:r>
@@ -4938,26 +4596,6 @@
     </w:p>
     <w:p>
       <w:pPr>
-        <w:pStyle w:val="af2"/>
-        <w:rPr>
-          <w:lang w:val="ru-RU"/>
-        </w:rPr>
-      </w:pPr>
-      <w:r>
-        <w:rPr>
-          <w:lang w:val="ru-RU"/>
-        </w:rPr>
-        <w:t>1</w:t>
-      </w:r>
-      <w:r>
-        <w:rPr>
-          <w:lang w:val="ru-RU"/>
-        </w:rPr>
-        <w:t>.4.2 Задание 2</w:t>
-      </w:r>
-    </w:p>
-    <w:p>
-      <w:pPr>
         <w:rPr>
           <w:lang w:val="ru-RU"/>
         </w:rPr>
@@ -5476,20 +5114,6 @@
     </w:p>
     <w:p>
       <w:pPr>
-        <w:pStyle w:val="af2"/>
-        <w:rPr>
-          <w:lang w:val="ru-RU"/>
-        </w:rPr>
-      </w:pPr>
-      <w:r>
-        <w:rPr>
-          <w:lang w:val="ru-RU"/>
-        </w:rPr>
-        <w:t>3.4.3 Задание 3</w:t>
-      </w:r>
-    </w:p>
-    <w:p>
-      <w:pPr>
         <w:rPr>
           <w:lang w:val="ru-RU"/>
         </w:rPr>
@@ -5701,27 +5325,6 @@
         </w:rPr>
         <w:t xml:space="preserve"> было успешно.</w:t>
       </w:r>
-    </w:p>
-    <w:p>
-      <w:pPr>
-        <w:pStyle w:val="af2"/>
-        <w:rPr>
-          <w:lang w:val="ru-RU"/>
-        </w:rPr>
-      </w:pPr>
-      <w:r>
-        <w:rPr>
-          <w:lang w:val="ru-RU"/>
-        </w:rPr>
-        <w:t>3.4.4 Задание 4</w:t>
-      </w:r>
-    </w:p>
-    <w:p>
-      <w:pPr>
-        <w:rPr>
-          <w:lang w:val="ru-RU"/>
-        </w:rPr>
-      </w:pPr>
       <w:r>
         <w:rPr>
           <w:lang w:val="ru-RU"/>
@@ -5914,36 +5517,10 @@
         <w:pStyle w:val="afa"/>
       </w:pPr>
       <w:r>
-        <w:t xml:space="preserve">3.5 </w:t>
-      </w:r>
-      <w:r>
-        <w:t xml:space="preserve">Решение на системе </w:t>
-      </w:r>
-      <w:r>
-        <w:rPr>
-          <w:lang w:val="en-US"/>
-        </w:rPr>
-        <w:t>Windows</w:t>
-      </w:r>
-      <w:r>
-        <w:t xml:space="preserve">. </w:t>
+        <w:t xml:space="preserve">2.2 </w:t>
       </w:r>
       <w:r>
         <w:t>Уровень 7-8.</w:t>
-      </w:r>
-    </w:p>
-    <w:p>
-      <w:pPr>
-        <w:pStyle w:val="af4"/>
-        <w:rPr>
-          <w:lang w:val="ru-RU"/>
-        </w:rPr>
-      </w:pPr>
-      <w:r>
-        <w:rPr>
-          <w:lang w:val="ru-RU"/>
-        </w:rPr>
-        <w:t>3.5.1 Задание 1</w:t>
       </w:r>
     </w:p>
     <w:p>
@@ -6124,27 +5701,6 @@
     </w:p>
     <w:p>
       <w:pPr>
-        <w:pStyle w:val="af2"/>
-        <w:rPr>
-          <w:lang w:val="ru-RU"/>
-        </w:rPr>
-      </w:pPr>
-      <w:r>
-        <w:rPr>
-          <w:lang w:val="ru-RU"/>
-        </w:rPr>
-        <w:lastRenderedPageBreak/>
-        <w:t xml:space="preserve">3.5.2 </w:t>
-      </w:r>
-      <w:r>
-        <w:rPr>
-          <w:lang w:val="ru-RU"/>
-        </w:rPr>
-        <w:t>Задание 2</w:t>
-      </w:r>
-    </w:p>
-    <w:p>
-      <w:pPr>
         <w:rPr>
           <w:lang w:val="ru-RU"/>
         </w:rPr>
@@ -6190,7 +5746,14 @@
         <w:rPr>
           <w:lang w:val="ru-RU"/>
         </w:rPr>
-        <w:t xml:space="preserve"> кол-во процессов, и пределы диапазонов поиска. Приложение само разделяет диапазон поиска на количество процессов. Простые числа программа выводит на консоль. Исходный код приложения </w:t>
+        <w:t xml:space="preserve"> кол-во процессов, и пределы диапазонов поиска. Приложение само разделяет диапазон поиска на </w:t>
+      </w:r>
+      <w:r>
+        <w:rPr>
+          <w:lang w:val="ru-RU"/>
+        </w:rPr>
+        <w:lastRenderedPageBreak/>
+        <w:t xml:space="preserve">количество процессов. Простые числа программа выводит на консоль. Исходный код приложения </w:t>
       </w:r>
       <w:r>
         <w:t>lab</w:t>
@@ -6442,36 +6005,13 @@
         <w:pStyle w:val="afa"/>
       </w:pPr>
       <w:r>
-        <w:t xml:space="preserve">3.6 </w:t>
-      </w:r>
-      <w:r>
-        <w:t xml:space="preserve">Решение на системе </w:t>
-      </w:r>
-      <w:r>
-        <w:rPr>
-          <w:lang w:val="en-US"/>
-        </w:rPr>
-        <w:t>Windows</w:t>
-      </w:r>
-      <w:r>
-        <w:t xml:space="preserve">. </w:t>
+        <w:t>2.3</w:t>
+      </w:r>
+      <w:r>
+        <w:t xml:space="preserve"> </w:t>
       </w:r>
       <w:r>
         <w:t>Уровень 9-10</w:t>
-      </w:r>
-    </w:p>
-    <w:p>
-      <w:pPr>
-        <w:pStyle w:val="af4"/>
-        <w:rPr>
-          <w:lang w:val="ru-RU"/>
-        </w:rPr>
-      </w:pPr>
-      <w:r>
-        <w:rPr>
-          <w:lang w:val="ru-RU"/>
-        </w:rPr>
-        <w:t>3.6.1 Задание 1</w:t>
       </w:r>
     </w:p>
     <w:p>
@@ -6728,7 +6268,6 @@
                 <w:rFonts w:ascii="Courier New" w:hAnsi="Courier New" w:cs="Courier New"/>
                 <w:sz w:val="24"/>
               </w:rPr>
-              <w:lastRenderedPageBreak/>
               <w:tab/>
               <w:t xml:space="preserve">STARTUPINFOA </w:t>
             </w:r>
@@ -7060,6 +6599,7 @@
                 <w:rFonts w:ascii="Courier New" w:hAnsi="Courier New" w:cs="Courier New"/>
                 <w:sz w:val="24"/>
               </w:rPr>
+              <w:lastRenderedPageBreak/>
               <w:t xml:space="preserve">    </w:t>
             </w:r>
             <w:proofErr w:type="spellStart"/>
@@ -7971,14 +7511,7 @@
         <w:rPr>
           <w:lang w:val="ru-RU"/>
         </w:rPr>
-        <w:t xml:space="preserve"> объект окна и выведете его название на консоль. </w:t>
-      </w:r>
-      <w:r>
-        <w:rPr>
-          <w:lang w:val="ru-RU"/>
-        </w:rPr>
-        <w:lastRenderedPageBreak/>
-        <w:t xml:space="preserve">Таким образом будет осуществлена передача текста при помощи структуры </w:t>
+        <w:t xml:space="preserve"> объект окна и выведете его название на консоль. Таким образом будет осуществлена передача текста при помощи структуры </w:t>
       </w:r>
       <w:r>
         <w:t>STARTUPINFO</w:t>
@@ -8021,6 +7554,7 @@
         <w:pStyle w:val="af6"/>
       </w:pPr>
       <w:r>
+        <w:lastRenderedPageBreak/>
         <w:drawing>
           <wp:inline distT="0" distB="0" distL="0" distR="0" wp14:anchorId="3180CC7B" wp14:editId="353169EB">
             <wp:extent cx="5887272" cy="1486107"/>
@@ -8109,10 +7643,10 @@
         <w:ind w:firstLine="709"/>
       </w:pPr>
       <w:r>
-        <w:t>4</w:t>
-      </w:r>
-      <w:r>
-        <w:t>. Заключение</w:t>
+        <w:t xml:space="preserve">3 </w:t>
+      </w:r>
+      <w:r>
+        <w:t>Заключение</w:t>
       </w:r>
     </w:p>
     <w:p>
@@ -8131,37 +7665,7 @@
         <w:rPr>
           <w:lang w:val="ru-RU"/>
         </w:rPr>
-        <w:t xml:space="preserve">В ходе выполнения работы был успешно освоен процесс </w:t>
-      </w:r>
-      <w:r>
-        <w:rPr>
-          <w:lang w:val="ru-RU"/>
-        </w:rPr>
-        <w:t>работы</w:t>
-      </w:r>
-      <w:r>
-        <w:rPr>
-          <w:lang w:val="ru-RU"/>
-        </w:rPr>
-        <w:t xml:space="preserve"> </w:t>
-      </w:r>
-      <w:r>
-        <w:rPr>
-          <w:lang w:val="ru-RU"/>
-        </w:rPr>
-        <w:t>с процессами и потоками ввода</w:t>
-      </w:r>
-      <w:r>
-        <w:rPr>
-          <w:lang w:val="ru-RU"/>
-        </w:rPr>
-        <w:t>/</w:t>
-      </w:r>
-      <w:r>
-        <w:rPr>
-          <w:lang w:val="ru-RU"/>
-        </w:rPr>
-        <w:t xml:space="preserve">вывода в системах </w:t>
+        <w:t xml:space="preserve">В ходе работы были освоены ключевые механизмы работы с процессами и вводом/выводом в </w:t>
       </w:r>
       <w:r>
         <w:t>Linux</w:t>
@@ -8170,13 +7674,7 @@
         <w:rPr>
           <w:lang w:val="ru-RU"/>
         </w:rPr>
-        <w:t xml:space="preserve"> </w:t>
-      </w:r>
-      <w:r>
-        <w:rPr>
-          <w:lang w:val="ru-RU"/>
-        </w:rPr>
-        <w:t xml:space="preserve">и </w:t>
+        <w:t xml:space="preserve"> и </w:t>
       </w:r>
       <w:r>
         <w:t>Windows</w:t>
@@ -8185,25 +7683,21 @@
         <w:rPr>
           <w:lang w:val="ru-RU"/>
         </w:rPr>
-        <w:t xml:space="preserve">. </w:t>
-      </w:r>
-      <w:r>
-        <w:rPr>
-          <w:lang w:val="ru-RU"/>
-        </w:rPr>
-        <w:t xml:space="preserve">Были </w:t>
-      </w:r>
-      <w:r>
-        <w:rPr>
-          <w:lang w:val="ru-RU"/>
-        </w:rPr>
-        <w:t>применены на практике</w:t>
-      </w:r>
-      <w:r>
-        <w:rPr>
-          <w:lang w:val="ru-RU"/>
-        </w:rPr>
-        <w:t xml:space="preserve"> переменные окружения</w:t>
+        <w:t xml:space="preserve">. На практике использовались переменные окружения, изучено их влияние на выполнение программ. Реализовано ожидание и управление дочерними процессами. Изучены функции создания процессов: </w:t>
+      </w:r>
+      <w:proofErr w:type="spellStart"/>
+      <w:r>
+        <w:t>CreateProcess</w:t>
+      </w:r>
+      <w:proofErr w:type="spellEnd"/>
+      <w:r>
+        <w:rPr>
+          <w:lang w:val="ru-RU"/>
+        </w:rPr>
+        <w:t xml:space="preserve"> в </w:t>
+      </w:r>
+      <w:r>
+        <w:t>Windows</w:t>
       </w:r>
       <w:r>
         <w:rPr>
@@ -8211,112 +7705,44 @@
         </w:rPr>
         <w:t xml:space="preserve">, </w:t>
       </w:r>
-      <w:r>
-        <w:rPr>
-          <w:lang w:val="ru-RU"/>
-        </w:rPr>
-        <w:t>изучено их влияние на работу</w:t>
-      </w:r>
-      <w:r>
-        <w:rPr>
-          <w:lang w:val="ru-RU"/>
-        </w:rPr>
-        <w:t xml:space="preserve"> созданных программ</w:t>
-      </w:r>
-      <w:r>
-        <w:rPr>
-          <w:lang w:val="ru-RU"/>
-        </w:rPr>
-        <w:t xml:space="preserve">. </w:t>
-      </w:r>
-      <w:r>
-        <w:rPr>
-          <w:lang w:val="ru-RU"/>
-        </w:rPr>
-        <w:t xml:space="preserve">Были освоены способы ожидания завершения дочерних процессов и управление их выполнением. Были изучены </w:t>
-      </w:r>
-      <w:r>
-        <w:rPr>
-          <w:lang w:val="ru-RU"/>
-        </w:rPr>
-        <w:t xml:space="preserve">функции </w:t>
+      <w:proofErr w:type="gramStart"/>
+      <w:r>
+        <w:t>fork</w:t>
+      </w:r>
+      <w:r>
+        <w:rPr>
+          <w:lang w:val="ru-RU"/>
+        </w:rPr>
+        <w:t>(</w:t>
+      </w:r>
+      <w:proofErr w:type="gramEnd"/>
+      <w:r>
+        <w:rPr>
+          <w:lang w:val="ru-RU"/>
+        </w:rPr>
+        <w:t xml:space="preserve">), </w:t>
       </w:r>
       <w:proofErr w:type="spellStart"/>
       <w:r>
-        <w:t>CreateProcess</w:t>
+        <w:t>execvp</w:t>
       </w:r>
       <w:proofErr w:type="spellEnd"/>
       <w:r>
         <w:rPr>
           <w:lang w:val="ru-RU"/>
         </w:rPr>
-        <w:t xml:space="preserve"> </w:t>
-      </w:r>
-      <w:r>
-        <w:rPr>
-          <w:lang w:val="ru-RU"/>
-        </w:rPr>
-        <w:t xml:space="preserve">для </w:t>
-      </w:r>
-      <w:r>
-        <w:t>Windows</w:t>
-      </w:r>
-      <w:r>
-        <w:rPr>
-          <w:lang w:val="ru-RU"/>
-        </w:rPr>
-        <w:t xml:space="preserve"> </w:t>
-      </w:r>
-      <w:r>
-        <w:rPr>
-          <w:lang w:val="ru-RU"/>
-        </w:rPr>
-        <w:t xml:space="preserve">и </w:t>
-      </w:r>
-      <w:proofErr w:type="gramStart"/>
-      <w:r>
-        <w:t>fork</w:t>
-      </w:r>
-      <w:r>
-        <w:rPr>
-          <w:lang w:val="ru-RU"/>
-        </w:rPr>
-        <w:t>(</w:t>
-      </w:r>
-      <w:proofErr w:type="gramEnd"/>
-      <w:r>
-        <w:rPr>
-          <w:lang w:val="ru-RU"/>
-        </w:rPr>
-        <w:t xml:space="preserve">), </w:t>
+        <w:t xml:space="preserve"> и </w:t>
       </w:r>
       <w:proofErr w:type="spellStart"/>
       <w:r>
-        <w:t>execvp</w:t>
+        <w:t>execlp</w:t>
       </w:r>
       <w:proofErr w:type="spellEnd"/>
       <w:r>
         <w:rPr>
           <w:lang w:val="ru-RU"/>
         </w:rPr>
-        <w:t xml:space="preserve">, </w:t>
-      </w:r>
-      <w:proofErr w:type="spellStart"/>
-      <w:r>
-        <w:t>execlp</w:t>
-      </w:r>
-      <w:proofErr w:type="spellEnd"/>
-      <w:r>
-        <w:rPr>
-          <w:lang w:val="ru-RU"/>
-        </w:rPr>
-        <w:t xml:space="preserve"> </w:t>
-      </w:r>
-      <w:r>
-        <w:rPr>
-          <w:lang w:val="ru-RU"/>
-        </w:rPr>
-        <w:t xml:space="preserve">для </w:t>
+        <w:t xml:space="preserve"> в </w:t>
       </w:r>
       <w:r>
         <w:t>Linux</w:t>
@@ -8325,13 +7751,7 @@
         <w:rPr>
           <w:lang w:val="ru-RU"/>
         </w:rPr>
-        <w:t xml:space="preserve">. </w:t>
-      </w:r>
-      <w:r>
-        <w:rPr>
-          <w:lang w:val="ru-RU"/>
-        </w:rPr>
-        <w:t xml:space="preserve">Так же внимание было уделено работе с сигналами в </w:t>
+        <w:t xml:space="preserve">. Также была рассмотрена работа с сигналами </w:t>
       </w:r>
       <w:r>
         <w:t>Linux</w:t>
@@ -8340,13 +7760,7 @@
         <w:rPr>
           <w:lang w:val="ru-RU"/>
         </w:rPr>
-        <w:t xml:space="preserve">: </w:t>
-      </w:r>
-      <w:r>
-        <w:rPr>
-          <w:lang w:val="ru-RU"/>
-        </w:rPr>
-        <w:t xml:space="preserve">изучены сигналы </w:t>
+        <w:t xml:space="preserve">, включая </w:t>
       </w:r>
       <w:r>
         <w:t>SIGUSR</w:t>
@@ -8382,16 +7796,8 @@
         <w:rPr>
           <w:lang w:val="ru-RU"/>
         </w:rPr>
-        <w:t xml:space="preserve"> для обработки пользовательских событий и завершения программы.</w:t>
-      </w:r>
-    </w:p>
-    <w:p>
-      <w:pPr>
-        <w:jc w:val="left"/>
-        <w:rPr>
-          <w:lang w:val="ru-RU"/>
-        </w:rPr>
-      </w:pPr>
+        <w:t>.</w:t>
+      </w:r>
       <w:r>
         <w:rPr>
           <w:lang w:val="ru-RU"/>
@@ -12194,23 +11600,7 @@
                 <w:rFonts w:ascii="Courier New" w:hAnsi="Courier New" w:cs="Courier New"/>
                 <w:sz w:val="24"/>
               </w:rPr>
-              <w:t xml:space="preserve"> </w:t>
-            </w:r>
-            <w:proofErr w:type="spellStart"/>
-            <w:r>
-              <w:rPr>
-                <w:rFonts w:ascii="Courier New" w:hAnsi="Courier New" w:cs="Courier New"/>
-                <w:sz w:val="24"/>
-              </w:rPr>
-              <w:t>pid</w:t>
-            </w:r>
-            <w:proofErr w:type="spellEnd"/>
-            <w:r>
-              <w:rPr>
-                <w:rFonts w:ascii="Courier New" w:hAnsi="Courier New" w:cs="Courier New"/>
-                <w:sz w:val="24"/>
-              </w:rPr>
-              <w:t xml:space="preserve"> = </w:t>
+              <w:t xml:space="preserve"> pid = </w:t>
             </w:r>
             <w:proofErr w:type="gramStart"/>
             <w:r>
@@ -13653,6 +13043,7 @@
         </w:rPr>
       </w:pPr>
       <w:r>
+        <w:lastRenderedPageBreak/>
         <w:t xml:space="preserve">Листинг А.3 – Исходный код </w:t>
       </w:r>
       <w:r>
@@ -15695,7 +15086,6 @@
               <w:rPr>
                 <w:rFonts w:ascii="Courier New" w:hAnsi="Courier New" w:cs="Courier New"/>
                 <w:sz w:val="24"/>
-                <w:lang w:val="ru-RU"/>
               </w:rPr>
               <w:t>}</w:t>
             </w:r>
@@ -15711,6 +15101,7 @@
         </w:rPr>
       </w:pPr>
       <w:r>
+        <w:lastRenderedPageBreak/>
         <w:t xml:space="preserve">Листинг Б.1 – Исходный код </w:t>
       </w:r>
       <w:r>
@@ -17730,6 +17121,7 @@
         <w:pStyle w:val="af8"/>
       </w:pPr>
       <w:r>
+        <w:lastRenderedPageBreak/>
         <w:t xml:space="preserve">Листинг Б.1 – Исходный код </w:t>
       </w:r>
       <w:r>
@@ -19800,6 +19192,7 @@
         </w:rPr>
       </w:pPr>
       <w:r>
+        <w:lastRenderedPageBreak/>
         <w:t xml:space="preserve">Листинг Б.3 – Исходный код </w:t>
       </w:r>
       <w:r>
@@ -20871,6 +20264,7 @@
         </w:rPr>
       </w:pPr>
       <w:r>
+        <w:lastRenderedPageBreak/>
         <w:t xml:space="preserve">Листинг Б.4 – Исходный код </w:t>
       </w:r>
       <w:r>
@@ -22386,6 +21780,7 @@
         </w:rPr>
       </w:pPr>
       <w:r>
+        <w:lastRenderedPageBreak/>
         <w:t xml:space="preserve">Листинг Б.5 – Исходный код </w:t>
       </w:r>
       <w:r>
@@ -29957,7 +29352,6 @@
   <w:style w:type="character" w:default="1" w:styleId="a0">
     <w:name w:val="Default Paragraph Font"/>
     <w:uiPriority w:val="1"/>
-    <w:semiHidden/>
     <w:unhideWhenUsed/>
   </w:style>
   <w:style w:type="table" w:default="1" w:styleId="a1">

</xml_diff>